<commit_message>
:sparkles: feat: Usuario escolher o site
</commit_message>
<xml_diff>
--- a/Documentacao.docx
+++ b/Documentacao.docx
@@ -53,25 +53,7 @@
           <w:sz w:val="24"/>
           <w:szCs w:val="24"/>
         </w:rPr>
-        <w:t xml:space="preserve"> Criar um site que o usuário consiga escolher um produto (colocando os links para o mesmo) para o </w:t>
-      </w:r>
-      <w:proofErr w:type="spellStart"/>
-      <w:r>
-        <w:rPr>
-          <w:rFonts w:ascii="Arial" w:hAnsi="Arial" w:cs="Arial"/>
-          <w:sz w:val="24"/>
-          <w:szCs w:val="24"/>
-        </w:rPr>
-        <w:t>backend</w:t>
-      </w:r>
-      <w:proofErr w:type="spellEnd"/>
-      <w:r>
-        <w:rPr>
-          <w:rFonts w:ascii="Arial" w:hAnsi="Arial" w:cs="Arial"/>
-          <w:sz w:val="24"/>
-          <w:szCs w:val="24"/>
-        </w:rPr>
-        <w:t xml:space="preserve"> buscar informações diárias dos preços deles. Mandando mensagens por e-mail ou celular caso o preço caia muito</w:t>
+        <w:t xml:space="preserve"> Criar um site que o usuário consiga escolher um produto (colocando os links para o mesmo) para o backend buscar informações diárias dos preços deles. Mandando mensagens por e-mail ou celular caso o preço caia muito</w:t>
       </w:r>
     </w:p>
     <w:p>
@@ -211,36 +193,8 @@
           <w:sz w:val="24"/>
           <w:szCs w:val="24"/>
         </w:rPr>
-        <w:t xml:space="preserve">Começo da programação em </w:t>
-      </w:r>
-      <w:proofErr w:type="spellStart"/>
-      <w:r>
-        <w:rPr>
-          <w:rFonts w:ascii="Arial" w:hAnsi="Arial" w:cs="Arial"/>
-          <w:sz w:val="24"/>
-          <w:szCs w:val="24"/>
-        </w:rPr>
-        <w:t>python</w:t>
-      </w:r>
-      <w:proofErr w:type="spellEnd"/>
-      <w:r>
-        <w:rPr>
-          <w:rFonts w:ascii="Arial" w:hAnsi="Arial" w:cs="Arial"/>
-          <w:sz w:val="24"/>
-          <w:szCs w:val="24"/>
-        </w:rPr>
-        <w:t xml:space="preserve"> do script de web </w:t>
-      </w:r>
-      <w:proofErr w:type="spellStart"/>
-      <w:r>
-        <w:rPr>
-          <w:rFonts w:ascii="Arial" w:hAnsi="Arial" w:cs="Arial"/>
-          <w:sz w:val="24"/>
-          <w:szCs w:val="24"/>
-        </w:rPr>
-        <w:t>scraping</w:t>
-      </w:r>
-      <w:proofErr w:type="spellEnd"/>
+        <w:t>Começo da programação em python do script de web scraping</w:t>
+      </w:r>
     </w:p>
     <w:p>
       <w:pPr>
@@ -330,25 +284,7 @@
           <w:sz w:val="24"/>
           <w:szCs w:val="24"/>
         </w:rPr>
-        <w:t xml:space="preserve">Autor: </w:t>
-      </w:r>
-      <w:proofErr w:type="spellStart"/>
-      <w:r>
-        <w:rPr>
-          <w:rFonts w:ascii="Arial" w:hAnsi="Arial" w:cs="Arial"/>
-          <w:sz w:val="24"/>
-          <w:szCs w:val="24"/>
-        </w:rPr>
-        <w:t>Dev</w:t>
-      </w:r>
-      <w:proofErr w:type="spellEnd"/>
-      <w:r>
-        <w:rPr>
-          <w:rFonts w:ascii="Arial" w:hAnsi="Arial" w:cs="Arial"/>
-          <w:sz w:val="24"/>
-          <w:szCs w:val="24"/>
-        </w:rPr>
-        <w:t xml:space="preserve"> Aprender | Jhonatan de Souza</w:t>
+        <w:t>Autor: Dev Aprender | Jhonatan de Souza</w:t>
       </w:r>
     </w:p>
     <w:p>
@@ -398,7 +334,55 @@
           <w:sz w:val="24"/>
           <w:szCs w:val="24"/>
         </w:rPr>
-        <w:t>Desafios para a próxima entrega:</w:t>
+        <w:t>Desafios para a</w:t>
+      </w:r>
+      <w:r>
+        <w:rPr>
+          <w:rFonts w:ascii="Arial" w:hAnsi="Arial" w:cs="Arial"/>
+          <w:sz w:val="24"/>
+          <w:szCs w:val="24"/>
+        </w:rPr>
+        <w:t>s</w:t>
+      </w:r>
+      <w:r>
+        <w:rPr>
+          <w:rFonts w:ascii="Arial" w:hAnsi="Arial" w:cs="Arial"/>
+          <w:sz w:val="24"/>
+          <w:szCs w:val="24"/>
+        </w:rPr>
+        <w:t xml:space="preserve"> próxima</w:t>
+      </w:r>
+      <w:r>
+        <w:rPr>
+          <w:rFonts w:ascii="Arial" w:hAnsi="Arial" w:cs="Arial"/>
+          <w:sz w:val="24"/>
+          <w:szCs w:val="24"/>
+        </w:rPr>
+        <w:t>s</w:t>
+      </w:r>
+      <w:r>
+        <w:rPr>
+          <w:rFonts w:ascii="Arial" w:hAnsi="Arial" w:cs="Arial"/>
+          <w:sz w:val="24"/>
+          <w:szCs w:val="24"/>
+        </w:rPr>
+        <w:t xml:space="preserve"> entrega</w:t>
+      </w:r>
+      <w:r>
+        <w:rPr>
+          <w:rFonts w:ascii="Arial" w:hAnsi="Arial" w:cs="Arial"/>
+          <w:sz w:val="24"/>
+          <w:szCs w:val="24"/>
+        </w:rPr>
+        <w:t>s</w:t>
+      </w:r>
+      <w:r>
+        <w:rPr>
+          <w:rFonts w:ascii="Arial" w:hAnsi="Arial" w:cs="Arial"/>
+          <w:sz w:val="24"/>
+          <w:szCs w:val="24"/>
+        </w:rPr>
+        <w:t>:</w:t>
       </w:r>
     </w:p>
     <w:p>
@@ -466,6 +450,363 @@
         </w:rPr>
         <w:t>Guardar tudo em um banco de dados</w:t>
       </w:r>
+    </w:p>
+    <w:p>
+      <w:pPr>
+        <w:rPr>
+          <w:rFonts w:ascii="Arial" w:hAnsi="Arial" w:cs="Arial"/>
+          <w:sz w:val="24"/>
+          <w:szCs w:val="24"/>
+        </w:rPr>
+      </w:pPr>
+    </w:p>
+    <w:p>
+      <w:pPr>
+        <w:rPr>
+          <w:rFonts w:ascii="Arial" w:hAnsi="Arial" w:cs="Arial"/>
+          <w:b/>
+          <w:bCs/>
+          <w:sz w:val="24"/>
+          <w:szCs w:val="24"/>
+        </w:rPr>
+      </w:pPr>
+      <w:r>
+        <w:rPr>
+          <w:rFonts w:ascii="Arial" w:hAnsi="Arial" w:cs="Arial"/>
+          <w:b/>
+          <w:bCs/>
+          <w:sz w:val="24"/>
+          <w:szCs w:val="24"/>
+        </w:rPr>
+        <w:t>DIA 0</w:t>
+      </w:r>
+      <w:r>
+        <w:rPr>
+          <w:rFonts w:ascii="Arial" w:hAnsi="Arial" w:cs="Arial"/>
+          <w:b/>
+          <w:bCs/>
+          <w:sz w:val="24"/>
+          <w:szCs w:val="24"/>
+        </w:rPr>
+        <w:t>6</w:t>
+      </w:r>
+      <w:r>
+        <w:rPr>
+          <w:rFonts w:ascii="Arial" w:hAnsi="Arial" w:cs="Arial"/>
+          <w:b/>
+          <w:bCs/>
+          <w:sz w:val="24"/>
+          <w:szCs w:val="24"/>
+        </w:rPr>
+        <w:t>/10 (</w:t>
+      </w:r>
+      <w:r>
+        <w:rPr>
+          <w:rFonts w:ascii="Arial" w:hAnsi="Arial" w:cs="Arial"/>
+          <w:b/>
+          <w:bCs/>
+          <w:sz w:val="24"/>
+          <w:szCs w:val="24"/>
+        </w:rPr>
+        <w:t>2</w:t>
+      </w:r>
+      <w:r>
+        <w:rPr>
+          <w:rFonts w:ascii="Arial" w:hAnsi="Arial" w:cs="Arial"/>
+          <w:b/>
+          <w:bCs/>
+          <w:sz w:val="24"/>
+          <w:szCs w:val="24"/>
+        </w:rPr>
+        <w:t>° dia)</w:t>
+      </w:r>
+    </w:p>
+    <w:p>
+      <w:pPr>
+        <w:rPr>
+          <w:rFonts w:ascii="Arial" w:hAnsi="Arial" w:cs="Arial"/>
+          <w:sz w:val="24"/>
+          <w:szCs w:val="24"/>
+        </w:rPr>
+      </w:pPr>
+      <w:r>
+        <w:rPr>
+          <w:rFonts w:ascii="Arial" w:hAnsi="Arial" w:cs="Arial"/>
+          <w:sz w:val="24"/>
+          <w:szCs w:val="24"/>
+        </w:rPr>
+        <w:t>Realizações:</w:t>
+      </w:r>
+    </w:p>
+    <w:p>
+      <w:pPr>
+        <w:pStyle w:val="PargrafodaLista"/>
+        <w:numPr>
+          <w:ilvl w:val="0"/>
+          <w:numId w:val="2"/>
+        </w:numPr>
+        <w:rPr>
+          <w:rFonts w:ascii="Arial" w:hAnsi="Arial" w:cs="Arial"/>
+          <w:sz w:val="24"/>
+          <w:szCs w:val="24"/>
+        </w:rPr>
+      </w:pPr>
+      <w:r>
+        <w:rPr>
+          <w:rFonts w:ascii="Arial" w:hAnsi="Arial" w:cs="Arial"/>
+          <w:sz w:val="24"/>
+          <w:szCs w:val="24"/>
+        </w:rPr>
+        <w:t>Busca de informações na documentação do framework S</w:t>
+      </w:r>
+      <w:r>
+        <w:rPr>
+          <w:rFonts w:ascii="Arial" w:hAnsi="Arial" w:cs="Arial"/>
+          <w:sz w:val="24"/>
+          <w:szCs w:val="24"/>
+        </w:rPr>
+        <w:t>elenium</w:t>
+      </w:r>
+    </w:p>
+    <w:p>
+      <w:pPr>
+        <w:pStyle w:val="PargrafodaLista"/>
+        <w:numPr>
+          <w:ilvl w:val="0"/>
+          <w:numId w:val="2"/>
+        </w:numPr>
+        <w:rPr>
+          <w:rFonts w:ascii="Arial" w:hAnsi="Arial" w:cs="Arial"/>
+          <w:sz w:val="24"/>
+          <w:szCs w:val="24"/>
+        </w:rPr>
+      </w:pPr>
+      <w:r>
+        <w:rPr>
+          <w:rFonts w:ascii="Arial" w:hAnsi="Arial" w:cs="Arial"/>
+          <w:sz w:val="24"/>
+          <w:szCs w:val="24"/>
+        </w:rPr>
+        <w:t xml:space="preserve">Utilização da IA </w:t>
+      </w:r>
+      <w:r>
+        <w:rPr>
+          <w:rFonts w:ascii="Arial" w:hAnsi="Arial" w:cs="Arial"/>
+          <w:sz w:val="24"/>
+          <w:szCs w:val="24"/>
+        </w:rPr>
+        <w:t>Claude</w:t>
+      </w:r>
+      <w:r>
+        <w:rPr>
+          <w:rFonts w:ascii="Arial" w:hAnsi="Arial" w:cs="Arial"/>
+          <w:sz w:val="24"/>
+          <w:szCs w:val="24"/>
+        </w:rPr>
+        <w:t xml:space="preserve"> para correção</w:t>
+      </w:r>
+      <w:r>
+        <w:rPr>
+          <w:rFonts w:ascii="Arial" w:hAnsi="Arial" w:cs="Arial"/>
+          <w:sz w:val="24"/>
+          <w:szCs w:val="24"/>
+        </w:rPr>
+        <w:t xml:space="preserve"> e entendimento</w:t>
+      </w:r>
+      <w:r>
+        <w:rPr>
+          <w:rFonts w:ascii="Arial" w:hAnsi="Arial" w:cs="Arial"/>
+          <w:sz w:val="24"/>
+          <w:szCs w:val="24"/>
+        </w:rPr>
+        <w:t xml:space="preserve"> do código</w:t>
+      </w:r>
+    </w:p>
+    <w:p>
+      <w:pPr>
+        <w:pStyle w:val="PargrafodaLista"/>
+        <w:numPr>
+          <w:ilvl w:val="0"/>
+          <w:numId w:val="2"/>
+        </w:numPr>
+        <w:rPr>
+          <w:rFonts w:ascii="Arial" w:hAnsi="Arial" w:cs="Arial"/>
+          <w:sz w:val="24"/>
+          <w:szCs w:val="24"/>
+        </w:rPr>
+      </w:pPr>
+      <w:r>
+        <w:rPr>
+          <w:rFonts w:ascii="Arial" w:hAnsi="Arial" w:cs="Arial"/>
+          <w:sz w:val="24"/>
+          <w:szCs w:val="24"/>
+        </w:rPr>
+        <w:t>O usuário consegue escolher o link de um site para a pesquisa do produto</w:t>
+      </w:r>
+    </w:p>
+    <w:p>
+      <w:pPr>
+        <w:pStyle w:val="PargrafodaLista"/>
+        <w:numPr>
+          <w:ilvl w:val="0"/>
+          <w:numId w:val="2"/>
+        </w:numPr>
+        <w:rPr>
+          <w:rFonts w:ascii="Arial" w:hAnsi="Arial" w:cs="Arial"/>
+          <w:sz w:val="24"/>
+          <w:szCs w:val="24"/>
+        </w:rPr>
+      </w:pPr>
+      <w:r>
+        <w:rPr>
+          <w:rFonts w:ascii="Arial" w:hAnsi="Arial" w:cs="Arial"/>
+          <w:sz w:val="24"/>
+          <w:szCs w:val="24"/>
+        </w:rPr>
+        <w:t>Estruturação do fluxo de execução do script</w:t>
+      </w:r>
+    </w:p>
+    <w:p>
+      <w:pPr>
+        <w:rPr>
+          <w:rFonts w:ascii="Arial" w:hAnsi="Arial" w:cs="Arial"/>
+          <w:sz w:val="24"/>
+          <w:szCs w:val="24"/>
+        </w:rPr>
+      </w:pPr>
+      <w:r>
+        <w:rPr>
+          <w:rFonts w:ascii="Arial" w:hAnsi="Arial" w:cs="Arial"/>
+          <w:sz w:val="24"/>
+          <w:szCs w:val="24"/>
+        </w:rPr>
+        <w:t>Desafios para a</w:t>
+      </w:r>
+      <w:r>
+        <w:rPr>
+          <w:rFonts w:ascii="Arial" w:hAnsi="Arial" w:cs="Arial"/>
+          <w:sz w:val="24"/>
+          <w:szCs w:val="24"/>
+        </w:rPr>
+        <w:t>s</w:t>
+      </w:r>
+      <w:r>
+        <w:rPr>
+          <w:rFonts w:ascii="Arial" w:hAnsi="Arial" w:cs="Arial"/>
+          <w:sz w:val="24"/>
+          <w:szCs w:val="24"/>
+        </w:rPr>
+        <w:t xml:space="preserve"> próxima</w:t>
+      </w:r>
+      <w:r>
+        <w:rPr>
+          <w:rFonts w:ascii="Arial" w:hAnsi="Arial" w:cs="Arial"/>
+          <w:sz w:val="24"/>
+          <w:szCs w:val="24"/>
+        </w:rPr>
+        <w:t>s</w:t>
+      </w:r>
+      <w:r>
+        <w:rPr>
+          <w:rFonts w:ascii="Arial" w:hAnsi="Arial" w:cs="Arial"/>
+          <w:sz w:val="24"/>
+          <w:szCs w:val="24"/>
+        </w:rPr>
+        <w:t xml:space="preserve"> entrega</w:t>
+      </w:r>
+      <w:r>
+        <w:rPr>
+          <w:rFonts w:ascii="Arial" w:hAnsi="Arial" w:cs="Arial"/>
+          <w:sz w:val="24"/>
+          <w:szCs w:val="24"/>
+        </w:rPr>
+        <w:t>s</w:t>
+      </w:r>
+      <w:r>
+        <w:rPr>
+          <w:rFonts w:ascii="Arial" w:hAnsi="Arial" w:cs="Arial"/>
+          <w:sz w:val="24"/>
+          <w:szCs w:val="24"/>
+        </w:rPr>
+        <w:t>:</w:t>
+      </w:r>
+    </w:p>
+    <w:p>
+      <w:pPr>
+        <w:pStyle w:val="PargrafodaLista"/>
+        <w:numPr>
+          <w:ilvl w:val="0"/>
+          <w:numId w:val="2"/>
+        </w:numPr>
+        <w:rPr>
+          <w:rFonts w:ascii="Arial" w:hAnsi="Arial" w:cs="Arial"/>
+          <w:sz w:val="24"/>
+          <w:szCs w:val="24"/>
+        </w:rPr>
+      </w:pPr>
+      <w:r>
+        <w:rPr>
+          <w:rFonts w:ascii="Arial" w:hAnsi="Arial" w:cs="Arial"/>
+          <w:sz w:val="24"/>
+          <w:szCs w:val="24"/>
+        </w:rPr>
+        <w:t>Automatizar a detecção do elemento HTML que contém o preço do produto</w:t>
+      </w:r>
+    </w:p>
+    <w:p>
+      <w:pPr>
+        <w:pStyle w:val="PargrafodaLista"/>
+        <w:numPr>
+          <w:ilvl w:val="0"/>
+          <w:numId w:val="2"/>
+        </w:numPr>
+        <w:rPr>
+          <w:rFonts w:ascii="Arial" w:hAnsi="Arial" w:cs="Arial"/>
+          <w:sz w:val="24"/>
+          <w:szCs w:val="24"/>
+        </w:rPr>
+      </w:pPr>
+      <w:r>
+        <w:rPr>
+          <w:rFonts w:ascii="Arial" w:hAnsi="Arial" w:cs="Arial"/>
+          <w:sz w:val="24"/>
+          <w:szCs w:val="24"/>
+        </w:rPr>
+        <w:t>Executar o programa automaticamente em horários específicos (Meia noite, se o site permitir)</w:t>
+      </w:r>
+    </w:p>
+    <w:p>
+      <w:pPr>
+        <w:pStyle w:val="PargrafodaLista"/>
+        <w:numPr>
+          <w:ilvl w:val="0"/>
+          <w:numId w:val="2"/>
+        </w:numPr>
+        <w:rPr>
+          <w:rFonts w:ascii="Arial" w:hAnsi="Arial" w:cs="Arial"/>
+          <w:sz w:val="24"/>
+          <w:szCs w:val="24"/>
+        </w:rPr>
+      </w:pPr>
+      <w:r>
+        <w:rPr>
+          <w:rFonts w:ascii="Arial" w:hAnsi="Arial" w:cs="Arial"/>
+          <w:sz w:val="24"/>
+          <w:szCs w:val="24"/>
+        </w:rPr>
+        <w:t>Guardar tudo em um banco de dados</w:t>
+      </w:r>
+    </w:p>
+    <w:p>
+      <w:pPr>
+        <w:rPr>
+          <w:rFonts w:ascii="Arial" w:hAnsi="Arial" w:cs="Arial"/>
+          <w:b/>
+          <w:bCs/>
+          <w:sz w:val="24"/>
+          <w:szCs w:val="24"/>
+        </w:rPr>
+      </w:pPr>
     </w:p>
     <w:p>
       <w:pPr>
@@ -1325,6 +1666,7 @@
   <w:style w:type="character" w:default="1" w:styleId="Fontepargpadro">
     <w:name w:val="Default Paragraph Font"/>
     <w:uiPriority w:val="1"/>
+    <w:semiHidden/>
     <w:unhideWhenUsed/>
   </w:style>
   <w:style w:type="table" w:default="1" w:styleId="Tabelanormal">

</xml_diff>